<commit_message>
Fix corpo dati nei casi d'uso
</commit_message>
<xml_diff>
--- a/doc/text/Casi d'uso.docx
+++ b/doc/text/Casi d'uso.docx
@@ -885,6 +885,19 @@
             </w:pPr>
             <w:r>
               <w:rPr>
+                <w:lang w:val="it-IT"/>
+              </w:rPr>
+              <w:t>Precondizione: il corpo dati non è ancora stato creato</w:t>
+            </w:r>
+          </w:p>
+          <w:p>
+            <w:pPr>
+              <w:rPr>
+                <w:lang w:val="it-IT"/>
+              </w:rPr>
+            </w:pPr>
+            <w:r>
+              <w:rPr>
                 <w:b/>
                 <w:bCs/>
                 <w:lang w:val="it-IT"/>
@@ -1865,7 +1878,25 @@
               <w:rPr>
                 <w:lang w:val="it-IT"/>
               </w:rPr>
-              <w:t>esiste almeno un corpo dati non ancora avviato</w:t>
+              <w:t>il</w:t>
+            </w:r>
+            <w:r>
+              <w:rPr>
+                <w:lang w:val="it-IT"/>
+              </w:rPr>
+              <w:t xml:space="preserve"> corpo dati</w:t>
+            </w:r>
+            <w:r>
+              <w:rPr>
+                <w:lang w:val="it-IT"/>
+              </w:rPr>
+              <w:t xml:space="preserve"> è stato creato ma</w:t>
+            </w:r>
+            <w:r>
+              <w:rPr>
+                <w:lang w:val="it-IT"/>
+              </w:rPr>
+              <w:t xml:space="preserve"> non ancora avviato</w:t>
             </w:r>
           </w:p>
           <w:p>
@@ -1917,13 +1948,57 @@
                 <w:bCs/>
                 <w:lang w:val="it-IT"/>
               </w:rPr>
-              <w:t xml:space="preserve">1. </w:t>
-            </w:r>
-            <w:r>
-              <w:rPr>
-                <w:lang w:val="it-IT"/>
-              </w:rPr>
-              <w:t>Il sistema presenta i corpi dati attivabili</w:t>
+              <w:t>1</w:t>
+            </w:r>
+            <w:r>
+              <w:rPr>
+                <w:b/>
+                <w:bCs/>
+                <w:lang w:val="it-IT"/>
+              </w:rPr>
+              <w:t>.</w:t>
+            </w:r>
+            <w:r>
+              <w:rPr>
+                <w:lang w:val="it-IT"/>
+              </w:rPr>
+              <w:t xml:space="preserve"> </w:t>
+            </w:r>
+            <w:r>
+              <w:rPr>
+                <w:lang w:val="it-IT"/>
+              </w:rPr>
+              <w:t>Il configuratore indica</w:t>
+            </w:r>
+            <w:r>
+              <w:rPr>
+                <w:lang w:val="it-IT"/>
+              </w:rPr>
+              <w:t xml:space="preserve"> le date</w:t>
+            </w:r>
+            <w:r>
+              <w:rPr>
+                <w:lang w:val="it-IT"/>
+              </w:rPr>
+              <w:t xml:space="preserve"> del mese i+3</w:t>
+            </w:r>
+            <w:r>
+              <w:rPr>
+                <w:lang w:val="it-IT"/>
+              </w:rPr>
+              <w:t xml:space="preserve"> precluse</w:t>
+            </w:r>
+            <w:r>
+              <w:rPr>
+                <w:lang w:val="it-IT"/>
+              </w:rPr>
+              <w:t xml:space="preserve"> a ogni visita</w:t>
+            </w:r>
+            <w:r>
+              <w:rPr>
+                <w:lang w:val="it-IT"/>
+              </w:rPr>
+              <w:t xml:space="preserve"> </w:t>
             </w:r>
           </w:p>
           <w:p>
@@ -1939,94 +2014,6 @@
                 <w:lang w:val="it-IT"/>
               </w:rPr>
               <w:t>2</w:t>
-            </w:r>
-            <w:r>
-              <w:rPr>
-                <w:b/>
-                <w:bCs/>
-                <w:lang w:val="it-IT"/>
-              </w:rPr>
-              <w:t xml:space="preserve">. </w:t>
-            </w:r>
-            <w:r>
-              <w:rPr>
-                <w:lang w:val="it-IT"/>
-              </w:rPr>
-              <w:t>Il configuratore sceglie</w:t>
-            </w:r>
-            <w:r>
-              <w:rPr>
-                <w:lang w:val="it-IT"/>
-              </w:rPr>
-              <w:t xml:space="preserve"> il corpo dati da attivare</w:t>
-            </w:r>
-          </w:p>
-          <w:p>
-            <w:pPr>
-              <w:rPr>
-                <w:lang w:val="it-IT"/>
-              </w:rPr>
-            </w:pPr>
-            <w:r>
-              <w:rPr>
-                <w:b/>
-                <w:bCs/>
-                <w:lang w:val="it-IT"/>
-              </w:rPr>
-              <w:t>3</w:t>
-            </w:r>
-            <w:r>
-              <w:rPr>
-                <w:b/>
-                <w:bCs/>
-                <w:lang w:val="it-IT"/>
-              </w:rPr>
-              <w:t>.</w:t>
-            </w:r>
-            <w:r>
-              <w:rPr>
-                <w:lang w:val="it-IT"/>
-              </w:rPr>
-              <w:t xml:space="preserve"> Indica le date</w:t>
-            </w:r>
-            <w:r>
-              <w:rPr>
-                <w:lang w:val="it-IT"/>
-              </w:rPr>
-              <w:t xml:space="preserve"> del mese i+3</w:t>
-            </w:r>
-            <w:r>
-              <w:rPr>
-                <w:lang w:val="it-IT"/>
-              </w:rPr>
-              <w:t xml:space="preserve"> precluse</w:t>
-            </w:r>
-            <w:r>
-              <w:rPr>
-                <w:lang w:val="it-IT"/>
-              </w:rPr>
-              <w:t xml:space="preserve"> a ogni visita</w:t>
-            </w:r>
-            <w:r>
-              <w:rPr>
-                <w:lang w:val="it-IT"/>
-              </w:rPr>
-              <w:t xml:space="preserve"> </w:t>
-            </w:r>
-          </w:p>
-          <w:p>
-            <w:pPr>
-              <w:rPr>
-                <w:lang w:val="it-IT"/>
-              </w:rPr>
-            </w:pPr>
-            <w:r>
-              <w:rPr>
-                <w:b/>
-                <w:bCs/>
-                <w:lang w:val="it-IT"/>
-              </w:rPr>
-              <w:t>4</w:t>
             </w:r>
             <w:r>
               <w:rPr>
@@ -2104,7 +2091,7 @@
                 <w:bCs/>
                 <w:lang w:val="it-IT"/>
               </w:rPr>
-              <w:t>3</w:t>
+              <w:t>1</w:t>
             </w:r>
             <w:r>
               <w:rPr>
@@ -2137,7 +2124,13 @@
               <w:rPr>
                 <w:lang w:val="it-IT"/>
               </w:rPr>
-              <w:t>Vai al punto 3</w:t>
+              <w:t xml:space="preserve">Vai al punto </w:t>
+            </w:r>
+            <w:r>
+              <w:rPr>
+                <w:lang w:val="it-IT"/>
+              </w:rPr>
+              <w:t>2</w:t>
             </w:r>
           </w:p>
         </w:tc>

</xml_diff>